<commit_message>
updated student details in report
Co-Authored-By: Claude Opus 5.5 <noreply@anthropic.com>
Claude-Session: https://claude.ai/code/session_01Qvn6Crg2PxvEKzbVTpKsJT
</commit_message>
<xml_diff>
--- a/report/Flight_Price_Prediction_Report.docx
+++ b/report/Flight_Price_Prediction_Report.docx
@@ -181,7 +181,7 @@
           <w:szCs w:val="26"/>
           <w:u w:val="single"/>
         </w:rPr>
-        <w:t xml:space="preserve">Utkarsh Mehta</w:t>
+        <w:t xml:space="preserve">Asmi Pandey</w:t>
       </w:r>
     </w:p>
     <w:p>
@@ -200,10 +200,12 @@
       <w:r>
         <w:rPr>
           <w:rFonts w:ascii="Calibri" w:cs="Calibri" w:eastAsia="Calibri" w:hAnsi="Calibri"/>
+          <w:color w:val="000000"/>
           <w:sz w:val="26"/>
           <w:szCs w:val="26"/>
-        </w:rPr>
-        <w:t xml:space="preserve">_________________________</w:t>
+          <w:u w:val="single"/>
+        </w:rPr>
+        <w:t xml:space="preserve">32</w:t>
       </w:r>
     </w:p>
     <w:p>
@@ -222,10 +224,12 @@
       <w:r>
         <w:rPr>
           <w:rFonts w:ascii="Calibri" w:cs="Calibri" w:eastAsia="Calibri" w:hAnsi="Calibri"/>
+          <w:color w:val="000000"/>
           <w:sz w:val="26"/>
           <w:szCs w:val="26"/>
-        </w:rPr>
-        <w:t xml:space="preserve">_________________________</w:t>
+          <w:u w:val="single"/>
+        </w:rPr>
+        <w:t xml:space="preserve">12418814</w:t>
       </w:r>
     </w:p>
     <w:p>
@@ -244,10 +248,12 @@
       <w:r>
         <w:rPr>
           <w:rFonts w:ascii="Calibri" w:cs="Calibri" w:eastAsia="Calibri" w:hAnsi="Calibri"/>
+          <w:color w:val="000000"/>
           <w:sz w:val="26"/>
           <w:szCs w:val="26"/>
-        </w:rPr>
-        <w:t xml:space="preserve">_________________________</w:t>
+          <w:u w:val="single"/>
+        </w:rPr>
+        <w:t xml:space="preserve">K3P24MT</w:t>
       </w:r>
     </w:p>
     <w:p>
@@ -439,15 +445,15 @@
           <w:sz w:val="24"/>
           <w:szCs w:val="24"/>
         </w:rPr>
-        <w:t xml:space="preserve">Utkarsh Mehta</w:t>
-      </w:r>
-      <w:r>
-        <w:rPr>
-          <w:rFonts w:ascii="Times New Roman" w:cs="Times New Roman" w:eastAsia="Times New Roman" w:hAnsi="Times New Roman"/>
-          <w:sz w:val="24"/>
-          <w:szCs w:val="24"/>
-        </w:rPr>
-        <w:t xml:space="preserve"> (Reg. No. ____________) as Academic Task 3 (Assignment 3) of the course </w:t>
+        <w:t xml:space="preserve">Asmi Pandey</w:t>
+      </w:r>
+      <w:r>
+        <w:rPr>
+          <w:rFonts w:ascii="Times New Roman" w:cs="Times New Roman" w:eastAsia="Times New Roman" w:hAnsi="Times New Roman"/>
+          <w:sz w:val="24"/>
+          <w:szCs w:val="24"/>
+        </w:rPr>
+        <w:t xml:space="preserve"> (Reg. No. 12418814, Roll No. 32, Section K3P24MT) as Academic Task 3 (Assignment 3) of the course </w:t>
       </w:r>
       <w:r>
         <w:rPr>
@@ -710,7 +716,7 @@
           <w:sz w:val="24"/>
           <w:szCs w:val="24"/>
         </w:rPr>
-        <w:t xml:space="preserve">Utkarsh Mehta</w:t>
+        <w:t xml:space="preserve">Asmi Pandey</w:t>
       </w:r>
       <w:r>
         <w:rPr>
@@ -895,7 +901,7 @@
           <w:sz w:val="24"/>
           <w:szCs w:val="24"/>
         </w:rPr>
-        <w:t xml:space="preserve">Utkarsh Mehta</w:t>
+        <w:t xml:space="preserve">Asmi Pandey</w:t>
       </w:r>
     </w:p>
     <w:p>
@@ -916,7 +922,7 @@
           <w:sz w:val="24"/>
           <w:szCs w:val="24"/>
         </w:rPr>
-        <w:t xml:space="preserve">Reg. No.: ____________</w:t>
+        <w:t xml:space="preserve">Reg. No.: 12418814</w:t>
       </w:r>
     </w:p>
     <w:p>
@@ -1083,7 +1089,7 @@
           <w:sz w:val="24"/>
           <w:szCs w:val="24"/>
         </w:rPr>
-        <w:t xml:space="preserve">Utkarsh Mehta</w:t>
+        <w:t xml:space="preserve">Asmi Pandey</w:t>
       </w:r>
     </w:p>
     <w:p>
@@ -1097,7 +1103,7 @@
           <w:sz w:val="24"/>
           <w:szCs w:val="24"/>
         </w:rPr>
-        <w:t xml:space="preserve">Reg. No.: ____________</w:t>
+        <w:t xml:space="preserve">Reg. No.: 12418814</w:t>
       </w:r>
     </w:p>
     <w:p>

</xml_diff>